<commit_message>
Remove ‘honest’ from ‘shortest route
</commit_message>
<xml_diff>
--- a/Carrowmore_Framing_and_Call.docx
+++ b/Carrowmore_Framing_and_Call.docx
@@ -135,17 +135,7 @@
         <w:spacing w:after="50"/>
       </w:pPr>
       <w:r>
-        <w:t xml:space="preserve">The keeper's: </w:t>
-      </w:r>
-      <w:r>
-        <w:rPr>
-          <w:i/>
-          <w:iCs/>
-        </w:rPr>
-        <w:t xml:space="preserve">"What am I qualified for, what am I nearly qualified for, and what is the shortest honest route from here to a job?"</w:t>
-      </w:r>
-      <w:r>
-        <w:t xml:space="preserve"> The redeployment shortlist runs on the same evidence, so one record serves both views.</w:t>
+        <w:t xml:space="preserve">The keeper's: what am I qualified for, what am I nearly qualified for, and what is the shortest route from here to a job? The redeployment shortlist runs on the same evidence, so one record serves both views.</w:t>
       </w:r>
     </w:p>
     <w:p>

</xml_diff>